<commit_message>
feat: mission before convocation, trainer prefill on signing page, clean mission timeline
</commit_message>
<xml_diff>
--- a/data/missions/b6297879e2dd_confirmation.docx
+++ b/data/missions/b6297879e2dd_confirmation.docx
@@ -175,7 +175,7 @@
         <w:rPr>
           <w:sz w:val="20"/>
         </w:rPr>
-        <w:t>Montant total, selon devis du 22/07/2026 : 2020 € TTC</w:t>
+        <w:t>Montant total, selon devis du 22/07/2026 : 1640 € TTC</w:t>
       </w:r>
     </w:p>
     <w:p>
@@ -321,7 +321,7 @@
         <w:rPr>
           <w:sz w:val="20"/>
         </w:rPr>
-        <w:t>Les conditions financières sont celles indiquées dans le devis du Prestataire en date du 22/07/2026, soit 2020 € TTC, payable selon les modalités précisées par le Prestataire dans ce devis.</w:t>
+        <w:t>Les conditions financières sont celles indiquées dans le devis du Prestataire en date du 22/07/2026, soit 1640 € TTC, payable selon les modalités précisées par le Prestataire dans ce devis.</w:t>
       </w:r>
     </w:p>
     <w:p>

</xml_diff>